<commit_message>
docs: add v0.11.0 runtime readiness audit
</commit_message>
<xml_diff>
--- a/user-docs/DeepSeek-Agent-V3-使用说明-0.11.0.docx
+++ b/user-docs/DeepSeek-Agent-V3-使用说明-0.11.0.docx
@@ -1692,7 +1692,7 @@
           <w:rFonts w:ascii="Arial" w:hAnsi="Arial" w:eastAsia="Microsoft YaHei"/>
           <w:sz w:val="21"/>
         </w:rPr>
-        <w:t>最新大型 TypeScript 在线验收未通过：runner 记录 36 次逻辑请求、31 个工具轮次、1,477,342 tokens；仅 `session_completed` 门失败。</w:t>
+        <w:t>已归档的 `final-prepublish-single-rerun` 大型 TypeScript 验收未通过：runner 记录 36 次逻辑请求、31 个工具轮次、1,477,342 tokens；仅 `session_completed` 门失败。</w:t>
       </w:r>
     </w:p>
     <w:p>
@@ -1704,7 +1704,19 @@
           <w:rFonts w:ascii="Arial" w:hAnsi="Arial" w:eastAsia="Microsoft YaHei"/>
           <w:sz w:val="21"/>
         </w:rPr>
-        <w:t>该失败定位为 artifact 意图跨分句误判与 conditional-mutation 漏判。修复后已通过上述确定性 4 main + 1 final synthesis 回归；为节省用户 DeepSeek API 余额，没有再次在线重跑。</w:t>
+        <w:t>当前验收目录另有一条生成于发布提交之前的 `final-20260715T025700` 失败记录：38 次逻辑请求、32 个工具轮次、1,573,936 tokens。它没有保存 `git_head` 或源码包哈希，不能可靠归属到最终发布提交，也不能静默当作不存在。</w:t>
+      </w:r>
+    </w:p>
+    <w:p>
+      <w:pPr>
+        <w:pStyle w:val="ListBullet"/>
+      </w:pPr>
+      <w:r>
+        <w:rPr>
+          <w:rFonts w:ascii="Arial" w:hAnsi="Arial" w:eastAsia="Microsoft YaHei"/>
+          <w:sz w:val="21"/>
+        </w:rPr>
+        <w:t>artifact 跨分句误判与 conditional-mutation 漏判修复后已通过确定性 4 main + 1 final synthesis 回归；最终提交 `113592c` 没有可明确归属的修复后大型在线成功记录。</w:t>
       </w:r>
     </w:p>
     <w:p/>
@@ -1715,6 +1727,32 @@
           <w:sz w:val="21"/>
         </w:rPr>
         <w:t>因此，当前可以声明离线全量与 focused 回归通过，也可以声明 Word/文本在线案例通过；不能声明 0.11.0 大型 TypeScript 在线验收已全通过。</w:t>
+      </w:r>
+    </w:p>
+    <w:p/>
+    <w:p>
+      <w:r>
+        <w:rPr>
+          <w:rFonts w:ascii="Arial" w:hAnsi="Arial" w:eastAsia="Microsoft YaHei"/>
+          <w:sz w:val="21"/>
+        </w:rPr>
+        <w:t>2026-07-15 的实例运行审计、已确认问题、修改位置和分版本建议位于：</w:t>
+      </w:r>
+    </w:p>
+    <w:p/>
+    <w:p>
+      <w:pPr>
+        <w:shd w:fill="F3F4F6"/>
+        <w:spacing w:before="60" w:after="120"/>
+      </w:pPr>
+      <w:r>
+        <w:rPr>
+          <w:rFonts w:ascii="Consolas" w:hAnsi="Consolas"/>
+          <w:sz w:val="18"/>
+        </w:rPr>
+        <w:t>/mnt/d/detail/deepseek/项目运行审计与改进建议/20260715/</w:t>
+        <w:br/>
+        <w:t>~/AI-Agent/user-docs/项目运行审计与改进建议/20260715/</w:t>
       </w:r>
     </w:p>
     <w:p/>
@@ -1807,6 +1845,42 @@
           <w:sz w:val="21"/>
         </w:rPr>
         <w:t>最新大型 TypeScript 案例修复后尚未再次在线验收，不能把确定性回归替代在线结论。</w:t>
+      </w:r>
+    </w:p>
+    <w:p>
+      <w:pPr>
+        <w:pStyle w:val="ListBullet"/>
+      </w:pPr>
+      <w:r>
+        <w:rPr>
+          <w:rFonts w:ascii="Arial" w:hAnsi="Arial" w:eastAsia="Microsoft YaHei"/>
+          <w:sz w:val="21"/>
+        </w:rPr>
+        <w:t>若安装了 Chroma 且保留当前默认 `memory.vector_enabled: true`，全新环境即使缺少 API Key，也可能在报告缺 Key 前下载约 79.3 MiB 的默认 ONNX 模型；不需要语义 Memory 时先关闭该开关。</w:t>
+      </w:r>
+    </w:p>
+    <w:p>
+      <w:pPr>
+        <w:pStyle w:val="ListBullet"/>
+      </w:pPr>
+      <w:r>
+        <w:rPr>
+          <w:rFonts w:ascii="Arial" w:hAnsi="Arial" w:eastAsia="Microsoft YaHei"/>
+          <w:sz w:val="21"/>
+        </w:rPr>
+        <w:t>当前直接任务 CLI 只在异常时返回非零；Session 以 failed/resumable 结束但 Runtime 正常返回文本时，进程仍可能返回 0。自动化必须同时检查 Session 终态或明确的未完成标记。</w:t>
+      </w:r>
+    </w:p>
+    <w:p>
+      <w:pPr>
+        <w:pStyle w:val="ListBullet"/>
+      </w:pPr>
+      <w:r>
+        <w:rPr>
+          <w:rFonts w:ascii="Arial" w:hAnsi="Arial" w:eastAsia="Microsoft YaHei"/>
+          <w:sz w:val="21"/>
+        </w:rPr>
+        <w:t>切换提交或更新 `pyproject.toml` 后应重新执行 `.venv/bin/pip install -e .`，避免 editable 安装元数据滞后于源码依赖声明。</w:t>
       </w:r>
     </w:p>
     <w:p>

</xml_diff>